<commit_message>
feat: design fixes for designations, remove history in facturation modal, style tabs as buttons in project details
</commit_message>
<xml_diff>
--- a/public/templates/proforma.docx
+++ b/public/templates/proforma.docx
@@ -589,386 +589,53 @@
           </w:tcPr>
           <w:p>
             <w:pPr>
-              <w:pStyle w:val="NormalWeb"/>
-              <w:shd w:val="clear" w:color="auto" w:fill="FFFFFF"/>
-              <w:spacing w:before="0" w:beforeAutospacing="0" w:after="0" w:afterAutospacing="0"/>
-              <w:jc w:val="both"/>
-              <w:rPr>
-                <w:rFonts w:ascii="Calibri" w:hAnsi="Calibri" w:cs="Arial"/>
-                <w:b/>
-                <w:bCs/>
-                <w:sz w:val="10"/>
-                <w:szCs w:val="10"/>
-              </w:rPr>
-            </w:pPr>
-          </w:p>
-          <w:p>
-            <w:pPr>
-              <w:pStyle w:val="NormalWeb"/>
-              <w:shd w:val="clear" w:color="auto" w:fill="FFFFFF"/>
-              <w:spacing w:before="0" w:beforeAutospacing="0" w:after="0" w:afterAutospacing="0"/>
-              <w:jc w:val="both"/>
-              <w:rPr>
-                <w:rFonts w:ascii="Calibri" w:hAnsi="Calibri" w:cs="Arial"/>
-                <w:b/>
-                <w:bCs/>
-                <w:sz w:val="22"/>
-                <w:szCs w:val="22"/>
-              </w:rPr>
-            </w:pPr>
-            <w:r>
-              <w:rPr>
-                <w:rFonts w:ascii="Calibri" w:hAnsi="Calibri" w:cs="Arial"/>
-                <w:b/>
-                <w:bCs/>
-                <w:sz w:val="22"/>
-                <w:szCs w:val="22"/>
-              </w:rPr>
-              <w:t xml:space="preserve">Logiciel </w:t>
-            </w:r>
-            <w:r>
-              <w:rPr>
-                <w:rFonts w:ascii="Calibri" w:eastAsia="Calibri" w:hAnsi="Calibri" w:cs="Tahoma"/>
-                <w:b/>
-                <w:bCs/>
-                <w:sz w:val="22"/>
-                <w:szCs w:val="22"/>
-                <w:lang w:eastAsia="en-US"/>
-              </w:rPr>
-              <w:t>{</w:t>
-            </w:r>
-            <w:proofErr w:type="spellStart"/>
-            <w:r>
-              <w:rPr>
-                <w:rFonts w:ascii="Calibri" w:eastAsia="Calibri" w:hAnsi="Calibri" w:cs="Tahoma"/>
-                <w:b/>
-                <w:bCs/>
-                <w:sz w:val="22"/>
-                <w:szCs w:val="22"/>
-                <w:lang w:eastAsia="en-US"/>
-              </w:rPr>
-              <w:t>product</w:t>
-            </w:r>
-            <w:proofErr w:type="spellEnd"/>
-            <w:r>
-              <w:rPr>
-                <w:rFonts w:ascii="Calibri" w:eastAsia="Calibri" w:hAnsi="Calibri" w:cs="Tahoma"/>
-                <w:b/>
-                <w:bCs/>
-                <w:sz w:val="22"/>
-                <w:szCs w:val="22"/>
-                <w:lang w:eastAsia="en-US"/>
-              </w:rPr>
-              <w:t>}</w:t>
-            </w:r>
-            <w:r>
-              <w:rPr>
-                <w:rFonts w:ascii="Calibri" w:hAnsi="Calibri" w:cs="Arial"/>
-                <w:b/>
-                <w:bCs/>
-                <w:sz w:val="22"/>
-                <w:szCs w:val="22"/>
-              </w:rPr>
-              <w:t xml:space="preserve">, Version </w:t>
-            </w:r>
-            <w:r>
-              <w:rPr>
-                <w:rFonts w:ascii="Calibri" w:eastAsia="Calibri" w:hAnsi="Calibri" w:cs="Tahoma"/>
-                <w:b/>
-                <w:bCs/>
-                <w:sz w:val="22"/>
-                <w:szCs w:val="22"/>
-                <w:lang w:eastAsia="en-US"/>
-              </w:rPr>
-              <w:t xml:space="preserve">{version} </w:t>
-            </w:r>
-            <w:r>
-              <w:rPr>
-                <w:rFonts w:cs="Tahoma"/>
-              </w:rPr>
-              <w:t>{</w:t>
-            </w:r>
-            <w:proofErr w:type="spellStart"/>
-            <w:r>
-              <w:rPr>
-                <w:rFonts w:ascii="Calibri" w:eastAsia="Calibri" w:hAnsi="Calibri" w:cs="Tahoma"/>
-                <w:sz w:val="22"/>
-                <w:szCs w:val="22"/>
-                <w:lang w:eastAsia="en-US"/>
-              </w:rPr>
-              <w:t>encaissement_annee</w:t>
-            </w:r>
-            <w:proofErr w:type="spellEnd"/>
-            <w:r>
-              <w:rPr>
-                <w:rFonts w:cs="Tahoma"/>
-              </w:rPr>
-              <w:t>}</w:t>
-            </w:r>
-          </w:p>
-          <w:p>
-            <w:pPr>
-              <w:pStyle w:val="NormalWeb"/>
-              <w:shd w:val="clear" w:color="auto" w:fill="FFFFFF"/>
-              <w:spacing w:before="0" w:beforeAutospacing="0" w:after="0" w:afterAutospacing="0"/>
-              <w:jc w:val="both"/>
-              <w:rPr>
-                <w:rFonts w:ascii="Calibri" w:hAnsi="Calibri" w:cs="Arial"/>
-                <w:i/>
-                <w:iCs/>
-                <w:sz w:val="22"/>
-                <w:szCs w:val="22"/>
-              </w:rPr>
-            </w:pPr>
-            <w:r>
-              <w:rPr>
-                <w:rFonts w:ascii="Calibri" w:eastAsia="Calibri" w:hAnsi="Calibri" w:cs="Tahoma"/>
-                <w:sz w:val="22"/>
-                <w:szCs w:val="22"/>
-                <w:lang w:eastAsia="en-US"/>
-              </w:rPr>
-              <w:t>{</w:t>
-            </w:r>
-            <w:proofErr w:type="spellStart"/>
-            <w:proofErr w:type="gramStart"/>
-            <w:r>
-              <w:rPr>
-                <w:rFonts w:ascii="Calibri" w:eastAsia="Calibri" w:hAnsi="Calibri" w:cs="Tahoma"/>
-                <w:sz w:val="22"/>
-                <w:szCs w:val="22"/>
-                <w:lang w:eastAsia="en-US"/>
-              </w:rPr>
-              <w:t>encaissement</w:t>
-            </w:r>
-            <w:proofErr w:type="gramEnd"/>
-            <w:r>
-              <w:rPr>
-                <w:rFonts w:ascii="Calibri" w:eastAsia="Calibri" w:hAnsi="Calibri" w:cs="Tahoma"/>
-                <w:sz w:val="22"/>
-                <w:szCs w:val="22"/>
-                <w:lang w:eastAsia="en-US"/>
-              </w:rPr>
-              <w:t>_</w:t>
-            </w:r>
-            <w:r>
-              <w:rPr>
-                <w:rFonts w:ascii="Calibri" w:eastAsia="Calibri" w:hAnsi="Calibri" w:cs="Tahoma"/>
-                <w:sz w:val="22"/>
-                <w:szCs w:val="22"/>
-                <w:lang w:eastAsia="en-US"/>
-              </w:rPr>
-              <w:t>mode</w:t>
-            </w:r>
-            <w:proofErr w:type="spellEnd"/>
-            <w:r>
-              <w:rPr>
-                <w:rFonts w:ascii="Calibri" w:eastAsia="Calibri" w:hAnsi="Calibri" w:cs="Tahoma"/>
-                <w:sz w:val="22"/>
-                <w:szCs w:val="22"/>
-                <w:lang w:eastAsia="en-US"/>
-              </w:rPr>
-              <w:t>}</w:t>
-            </w:r>
-            <w:r>
-              <w:rPr>
-                <w:rFonts w:ascii="Calibri" w:eastAsia="Calibri" w:hAnsi="Calibri" w:cs="Tahoma"/>
-                <w:sz w:val="22"/>
-                <w:szCs w:val="22"/>
-                <w:lang w:eastAsia="en-US"/>
-              </w:rPr>
-              <w:t xml:space="preserve"> </w:t>
-            </w:r>
-          </w:p>
-          <w:p>
-            <w:pPr>
-              <w:pStyle w:val="Paragraphedeliste"/>
               <w:widowControl w:val="0"/>
-              <w:numPr>
-                <w:ilvl w:val="0"/>
-                <w:numId w:val="3"/>
-              </w:numPr>
               <w:tabs>
                 <w:tab w:val="left" w:pos="326"/>
               </w:tabs>
               <w:autoSpaceDE w:val="0"/>
               <w:autoSpaceDN w:val="0"/>
-              <w:ind w:left="312" w:hanging="187"/>
               <w:rPr>
                 <w:rFonts w:cs="Tahoma"/>
               </w:rPr>
             </w:pPr>
             <w:r>
               <w:rPr>
-                <w:rFonts w:cs="Arial"/>
-              </w:rPr>
-              <w:t>Monitoring régulier</w:t>
+                <w:rFonts w:ascii="Calibri" w:eastAsia="Calibri" w:hAnsi="Calibri" w:cs="Tahoma"/>
+                <w:sz w:val="22"/>
+                <w:szCs w:val="22"/>
+                <w:lang w:eastAsia="en-US"/>
+              </w:rPr>
+              <w:t>{</w:t>
+            </w:r>
+            <w:proofErr w:type="gramStart"/>
+            <w:r>
+              <w:rPr>
+                <w:rFonts w:ascii="Calibri" w:eastAsia="Calibri" w:hAnsi="Calibri" w:cs="Tahoma"/>
+                <w:sz w:val="22"/>
+                <w:szCs w:val="22"/>
+                <w:lang w:eastAsia="en-US"/>
+              </w:rPr>
+              <w:t>des</w:t>
             </w:r>
             <w:r>
               <w:rPr>
-                <w:rFonts w:cs="Arial"/>
-              </w:rPr>
-              <w:t xml:space="preserve"> </w:t>
+                <w:rFonts w:ascii="Calibri" w:eastAsia="Calibri" w:hAnsi="Calibri" w:cs="Tahoma"/>
+                <w:sz w:val="22"/>
+                <w:szCs w:val="22"/>
+                <w:lang w:eastAsia="en-US"/>
+              </w:rPr>
+              <w:t>cription</w:t>
             </w:r>
-          </w:p>
-          <w:p>
-            <w:pPr>
-              <w:pStyle w:val="Paragraphedeliste"/>
-              <w:widowControl w:val="0"/>
-              <w:numPr>
-                <w:ilvl w:val="0"/>
-                <w:numId w:val="3"/>
-              </w:numPr>
-              <w:tabs>
-                <w:tab w:val="left" w:pos="326"/>
-              </w:tabs>
-              <w:autoSpaceDE w:val="0"/>
-              <w:autoSpaceDN w:val="0"/>
-              <w:ind w:left="312" w:hanging="187"/>
-              <w:rPr>
-                <w:rFonts w:cs="Tahoma"/>
-              </w:rPr>
-            </w:pPr>
+            <w:proofErr w:type="gramEnd"/>
             <w:r>
               <w:rPr>
-                <w:rFonts w:cs="Tahoma"/>
-              </w:rPr>
-              <w:t xml:space="preserve">Mises à jour </w:t>
-            </w:r>
-            <w:r>
-              <w:rPr>
-                <w:rFonts w:cs="Tahoma"/>
-              </w:rPr>
-              <w:t>{</w:t>
-            </w:r>
-            <w:proofErr w:type="spellStart"/>
-            <w:r>
-              <w:rPr>
-                <w:rFonts w:cs="Tahoma"/>
-              </w:rPr>
-              <w:t>encaissement_annee</w:t>
-            </w:r>
-            <w:proofErr w:type="spellEnd"/>
-            <w:r>
-              <w:rPr>
-                <w:rFonts w:cs="Tahoma"/>
+                <w:rFonts w:ascii="Calibri" w:eastAsia="Calibri" w:hAnsi="Calibri" w:cs="Tahoma"/>
+                <w:sz w:val="22"/>
+                <w:szCs w:val="22"/>
+                <w:lang w:eastAsia="en-US"/>
               </w:rPr>
               <w:t>}</w:t>
-            </w:r>
-          </w:p>
-          <w:p>
-            <w:pPr>
-              <w:pStyle w:val="Paragraphedeliste"/>
-              <w:widowControl w:val="0"/>
-              <w:numPr>
-                <w:ilvl w:val="0"/>
-                <w:numId w:val="3"/>
-              </w:numPr>
-              <w:tabs>
-                <w:tab w:val="left" w:pos="326"/>
-              </w:tabs>
-              <w:autoSpaceDE w:val="0"/>
-              <w:autoSpaceDN w:val="0"/>
-              <w:ind w:left="312" w:hanging="187"/>
-              <w:rPr>
-                <w:rFonts w:cs="Tahoma"/>
-              </w:rPr>
-            </w:pPr>
-            <w:r>
-              <w:rPr>
-                <w:rFonts w:cs="Tahoma"/>
-              </w:rPr>
-              <w:t xml:space="preserve">Téléassistance </w:t>
-            </w:r>
-            <w:r>
-              <w:rPr>
-                <w:rFonts w:cs="Tahoma"/>
-              </w:rPr>
-              <w:t xml:space="preserve">annuelle </w:t>
-            </w:r>
-            <w:r>
-              <w:rPr>
-                <w:rFonts w:cs="Tahoma"/>
-              </w:rPr>
-              <w:t>(</w:t>
-            </w:r>
-            <w:r>
-              <w:rPr>
-                <w:rFonts w:cs="Tahoma"/>
-              </w:rPr>
-              <w:t>Heures de bureau</w:t>
-            </w:r>
-            <w:r>
-              <w:rPr>
-                <w:rFonts w:cs="Tahoma"/>
-              </w:rPr>
-              <w:t>, D</w:t>
-            </w:r>
-            <w:r>
-              <w:rPr>
-                <w:rFonts w:cs="Tahoma"/>
-              </w:rPr>
-              <w:t>u Dimanche au Jeudi</w:t>
-            </w:r>
-            <w:r>
-              <w:rPr>
-                <w:rFonts w:cs="Tahoma"/>
-              </w:rPr>
-              <w:t>)</w:t>
-            </w:r>
-          </w:p>
-          <w:p>
-            <w:pPr>
-              <w:pStyle w:val="Paragraphedeliste"/>
-              <w:widowControl w:val="0"/>
-              <w:numPr>
-                <w:ilvl w:val="0"/>
-                <w:numId w:val="3"/>
-              </w:numPr>
-              <w:tabs>
-                <w:tab w:val="left" w:pos="326"/>
-              </w:tabs>
-              <w:autoSpaceDE w:val="0"/>
-              <w:autoSpaceDN w:val="0"/>
-              <w:ind w:left="312" w:hanging="187"/>
-              <w:rPr>
-                <w:rFonts w:cs="Tahoma"/>
-              </w:rPr>
-            </w:pPr>
-            <w:r>
-              <w:rPr>
-                <w:rFonts w:cs="Tahoma"/>
-              </w:rPr>
-              <w:t>Télé-intervention</w:t>
-            </w:r>
-            <w:r>
-              <w:rPr>
-                <w:rFonts w:cs="Tahoma"/>
-              </w:rPr>
-              <w:t xml:space="preserve"> annuelle</w:t>
-            </w:r>
-            <w:r>
-              <w:rPr>
-                <w:rFonts w:cs="Tahoma"/>
-              </w:rPr>
-              <w:t xml:space="preserve"> </w:t>
-            </w:r>
-            <w:r>
-              <w:rPr>
-                <w:rFonts w:cs="Tahoma"/>
-              </w:rPr>
-              <w:t>(</w:t>
-            </w:r>
-            <w:r>
-              <w:rPr>
-                <w:rFonts w:cs="Tahoma"/>
-              </w:rPr>
-              <w:t>Heures de bureau, D</w:t>
-            </w:r>
-            <w:r>
-              <w:rPr>
-                <w:rFonts w:cs="Tahoma"/>
-              </w:rPr>
-              <w:t>u Dimanche au Jeudi)</w:t>
             </w:r>
           </w:p>
           <w:p>
@@ -4081,6 +3748,18 @@
       <w:szCs w:val="22"/>
     </w:rPr>
   </w:style>
+  <w:style w:type="character" w:styleId="Mentionnonrsolue">
+    <w:name w:val="Unresolved Mention"/>
+    <w:basedOn w:val="Policepardfaut"/>
+    <w:uiPriority w:val="99"/>
+    <w:semiHidden/>
+    <w:unhideWhenUsed/>
+    <w:rsid w:val="00871573"/>
+    <w:rPr>
+      <w:color w:val="605E5C"/>
+      <w:shd w:val="clear" w:color="auto" w:fill="E1DFDD"/>
+    </w:rPr>
+  </w:style>
 </w:styles>
 </file>
 

</xml_diff>

<commit_message>
Fix form styles, permissions, AI model and layout alignments
</commit_message>
<xml_diff>
--- a/public/templates/proforma.docx
+++ b/public/templates/proforma.docx
@@ -22,21 +22,12 @@
           <w:lang w:val="es-ES"/>
         </w:rPr>
       </w:pPr>
-      <w:proofErr w:type="spellStart"/>
       <w:r>
         <w:rPr>
           <w:rFonts w:ascii="Calibri" w:hAnsi="Calibri" w:cs="Arial"/>
           <w:lang w:val="es-ES"/>
         </w:rPr>
-        <w:t>Tlemcen</w:t>
-      </w:r>
-      <w:proofErr w:type="spellEnd"/>
-      <w:r>
-        <w:rPr>
-          <w:rFonts w:ascii="Calibri" w:hAnsi="Calibri" w:cs="Arial"/>
-          <w:lang w:val="es-ES"/>
-        </w:rPr>
-        <w:t>, le</w:t>
+        <w:t>Tlemcen, le</w:t>
       </w:r>
       <w:r>
         <w:rPr>
@@ -177,7 +168,6 @@
         </w:rPr>
         <w:t>{</w:t>
       </w:r>
-      <w:proofErr w:type="spellStart"/>
       <w:r>
         <w:rPr>
           <w:rFonts w:ascii="Calibri" w:hAnsi="Calibri" w:cs="Arial"/>
@@ -191,7 +181,6 @@
         </w:rPr>
         <w:t>document_number</w:t>
       </w:r>
-      <w:proofErr w:type="spellEnd"/>
       <w:r>
         <w:rPr>
           <w:rFonts w:ascii="Calibri" w:hAnsi="Calibri" w:cs="Arial"/>
@@ -238,19 +227,32 @@
           <w:szCs w:val="22"/>
           <w:lang w:eastAsia="en-US"/>
         </w:rPr>
-        <w:t>{</w:t>
+        <w:t>{client_name}</w:t>
       </w:r>
-      <w:proofErr w:type="spellStart"/>
-      <w:r>
+    </w:p>
+    <w:p>
+      <w:pPr>
         <w:rPr>
           <w:rFonts w:ascii="Calibri" w:eastAsia="Calibri" w:hAnsi="Calibri" w:cs="Tahoma"/>
           <w:sz w:val="22"/>
           <w:szCs w:val="22"/>
           <w:lang w:eastAsia="en-US"/>
         </w:rPr>
-        <w:t>client_name</w:t>
+      </w:pPr>
+      <w:r>
+        <w:rPr>
+          <w:rFonts w:ascii="Calibri" w:hAnsi="Calibri" w:cs="Arial"/>
+          <w:b/>
+          <w:bCs/>
+        </w:rPr>
+        <w:t>Adresse</w:t>
       </w:r>
-      <w:proofErr w:type="spellEnd"/>
+      <w:r>
+        <w:rPr>
+          <w:rFonts w:ascii="Calibri" w:hAnsi="Calibri" w:cs="Arial"/>
+        </w:rPr>
+        <w:t xml:space="preserve"> : </w:t>
+      </w:r>
       <w:r>
         <w:rPr>
           <w:rFonts w:ascii="Calibri" w:eastAsia="Calibri" w:hAnsi="Calibri" w:cs="Tahoma"/>
@@ -258,69 +260,16 @@
           <w:szCs w:val="22"/>
           <w:lang w:eastAsia="en-US"/>
         </w:rPr>
-        <w:t>}</w:t>
+        <w:t>{client</w:t>
       </w:r>
-    </w:p>
-    <w:p>
-      <w:pPr>
+      <w:r>
         <w:rPr>
           <w:rFonts w:ascii="Calibri" w:eastAsia="Calibri" w:hAnsi="Calibri" w:cs="Tahoma"/>
           <w:sz w:val="22"/>
           <w:szCs w:val="22"/>
           <w:lang w:eastAsia="en-US"/>
         </w:rPr>
-      </w:pPr>
-      <w:r>
-        <w:rPr>
-          <w:rFonts w:ascii="Calibri" w:hAnsi="Calibri" w:cs="Arial"/>
-          <w:b/>
-          <w:bCs/>
-        </w:rPr>
-        <w:t>Adresse</w:t>
-      </w:r>
-      <w:r>
-        <w:rPr>
-          <w:rFonts w:ascii="Calibri" w:hAnsi="Calibri" w:cs="Arial"/>
-        </w:rPr>
-        <w:t xml:space="preserve"> : </w:t>
-      </w:r>
-      <w:r>
-        <w:rPr>
-          <w:rFonts w:ascii="Calibri" w:eastAsia="Calibri" w:hAnsi="Calibri" w:cs="Tahoma"/>
-          <w:sz w:val="22"/>
-          <w:szCs w:val="22"/>
-          <w:lang w:eastAsia="en-US"/>
-        </w:rPr>
-        <w:t>{</w:t>
-      </w:r>
-      <w:proofErr w:type="spellStart"/>
-      <w:r>
-        <w:rPr>
-          <w:rFonts w:ascii="Calibri" w:eastAsia="Calibri" w:hAnsi="Calibri" w:cs="Tahoma"/>
-          <w:sz w:val="22"/>
-          <w:szCs w:val="22"/>
-          <w:lang w:eastAsia="en-US"/>
-        </w:rPr>
-        <w:t>client</w:t>
-      </w:r>
-      <w:r>
-        <w:rPr>
-          <w:rFonts w:ascii="Calibri" w:eastAsia="Calibri" w:hAnsi="Calibri" w:cs="Tahoma"/>
-          <w:sz w:val="22"/>
-          <w:szCs w:val="22"/>
-          <w:lang w:eastAsia="en-US"/>
-        </w:rPr>
-        <w:t>_address</w:t>
-      </w:r>
-      <w:proofErr w:type="spellEnd"/>
-      <w:r>
-        <w:rPr>
-          <w:rFonts w:ascii="Calibri" w:eastAsia="Calibri" w:hAnsi="Calibri" w:cs="Tahoma"/>
-          <w:sz w:val="22"/>
-          <w:szCs w:val="22"/>
-          <w:lang w:eastAsia="en-US"/>
-        </w:rPr>
-        <w:t>}</w:t>
+        <w:t>_address}</w:t>
       </w:r>
     </w:p>
     <w:p>
@@ -354,8 +303,8 @@
       </w:tblPr>
       <w:tblGrid>
         <w:gridCol w:w="532"/>
-        <w:gridCol w:w="6901"/>
-        <w:gridCol w:w="1292"/>
+        <w:gridCol w:w="6693"/>
+        <w:gridCol w:w="1500"/>
         <w:gridCol w:w="572"/>
         <w:gridCol w:w="1548"/>
       </w:tblGrid>
@@ -395,7 +344,7 @@
         </w:tc>
         <w:tc>
           <w:tcPr>
-            <w:tcW w:w="6901" w:type="dxa"/>
+            <w:tcW w:w="6693" w:type="dxa"/>
             <w:vAlign w:val="center"/>
           </w:tcPr>
           <w:p>
@@ -421,7 +370,7 @@
         </w:tc>
         <w:tc>
           <w:tcPr>
-            <w:tcW w:w="1292" w:type="dxa"/>
+            <w:tcW w:w="1500" w:type="dxa"/>
             <w:vAlign w:val="center"/>
           </w:tcPr>
           <w:p>
@@ -584,7 +533,7 @@
         </w:tc>
         <w:tc>
           <w:tcPr>
-            <w:tcW w:w="6901" w:type="dxa"/>
+            <w:tcW w:w="6693" w:type="dxa"/>
             <w:vAlign w:val="center"/>
           </w:tcPr>
           <w:p>
@@ -608,7 +557,6 @@
               </w:rPr>
               <w:t>{</w:t>
             </w:r>
-            <w:proofErr w:type="gramStart"/>
             <w:r>
               <w:rPr>
                 <w:rFonts w:ascii="Calibri" w:eastAsia="Calibri" w:hAnsi="Calibri" w:cs="Tahoma"/>
@@ -627,7 +575,6 @@
               </w:rPr>
               <w:t>cription</w:t>
             </w:r>
-            <w:proofErr w:type="gramEnd"/>
             <w:r>
               <w:rPr>
                 <w:rFonts w:ascii="Calibri" w:eastAsia="Calibri" w:hAnsi="Calibri" w:cs="Tahoma"/>
@@ -653,7 +600,7 @@
         </w:tc>
         <w:tc>
           <w:tcPr>
-            <w:tcW w:w="1292" w:type="dxa"/>
+            <w:tcW w:w="1500" w:type="dxa"/>
             <w:vAlign w:val="center"/>
           </w:tcPr>
           <w:p>
@@ -676,8 +623,6 @@
               </w:rPr>
               <w:t>{</w:t>
             </w:r>
-            <w:proofErr w:type="spellStart"/>
-            <w:proofErr w:type="gramStart"/>
             <w:r>
               <w:rPr>
                 <w:rFonts w:ascii="Calibri" w:eastAsia="Calibri" w:hAnsi="Calibri" w:cs="Tahoma"/>
@@ -687,7 +632,6 @@
               </w:rPr>
               <w:t>prix</w:t>
             </w:r>
-            <w:proofErr w:type="gramEnd"/>
             <w:r>
               <w:rPr>
                 <w:rFonts w:ascii="Calibri" w:eastAsia="Calibri" w:hAnsi="Calibri" w:cs="Tahoma"/>
@@ -708,7 +652,6 @@
               </w:rPr>
               <w:t>ht</w:t>
             </w:r>
-            <w:proofErr w:type="spellEnd"/>
             <w:r>
               <w:rPr>
                 <w:rFonts w:ascii="Calibri" w:eastAsia="Calibri" w:hAnsi="Calibri" w:cs="Tahoma"/>
@@ -771,8 +714,6 @@
               </w:rPr>
               <w:t>{</w:t>
             </w:r>
-            <w:proofErr w:type="spellStart"/>
-            <w:proofErr w:type="gramStart"/>
             <w:r>
               <w:rPr>
                 <w:rFonts w:ascii="Calibri" w:eastAsia="Calibri" w:hAnsi="Calibri" w:cs="Tahoma"/>
@@ -782,7 +723,6 @@
               </w:rPr>
               <w:t>prix</w:t>
             </w:r>
-            <w:proofErr w:type="gramEnd"/>
             <w:r>
               <w:rPr>
                 <w:rFonts w:ascii="Calibri" w:eastAsia="Calibri" w:hAnsi="Calibri" w:cs="Tahoma"/>
@@ -803,7 +743,6 @@
               </w:rPr>
               <w:t>ht</w:t>
             </w:r>
-            <w:proofErr w:type="spellEnd"/>
             <w:r>
               <w:rPr>
                 <w:rFonts w:ascii="Calibri" w:eastAsia="Calibri" w:hAnsi="Calibri" w:cs="Tahoma"/>
@@ -881,8 +820,6 @@
               </w:rPr>
               <w:t>{</w:t>
             </w:r>
-            <w:proofErr w:type="spellStart"/>
-            <w:proofErr w:type="gramStart"/>
             <w:r>
               <w:rPr>
                 <w:rFonts w:ascii="Calibri" w:eastAsia="Calibri" w:hAnsi="Calibri" w:cs="Tahoma"/>
@@ -892,7 +829,6 @@
               </w:rPr>
               <w:t>prix</w:t>
             </w:r>
-            <w:proofErr w:type="gramEnd"/>
             <w:r>
               <w:rPr>
                 <w:rFonts w:ascii="Calibri" w:eastAsia="Calibri" w:hAnsi="Calibri" w:cs="Tahoma"/>
@@ -913,7 +849,6 @@
               </w:rPr>
               <w:t>ht</w:t>
             </w:r>
-            <w:proofErr w:type="spellEnd"/>
             <w:r>
               <w:rPr>
                 <w:rFonts w:ascii="Calibri" w:eastAsia="Calibri" w:hAnsi="Calibri" w:cs="Tahoma"/>
@@ -985,7 +920,6 @@
               </w:rPr>
               <w:t>{</w:t>
             </w:r>
-            <w:proofErr w:type="gramStart"/>
             <w:r>
               <w:rPr>
                 <w:rFonts w:ascii="Calibri" w:eastAsia="Calibri" w:hAnsi="Calibri" w:cs="Tahoma"/>
@@ -995,7 +929,6 @@
               </w:rPr>
               <w:t>tva</w:t>
             </w:r>
-            <w:proofErr w:type="gramEnd"/>
             <w:r>
               <w:rPr>
                 <w:rFonts w:ascii="Calibri" w:eastAsia="Calibri" w:hAnsi="Calibri" w:cs="Tahoma"/>
@@ -1071,8 +1004,6 @@
               </w:rPr>
               <w:t>{</w:t>
             </w:r>
-            <w:proofErr w:type="spellStart"/>
-            <w:proofErr w:type="gramStart"/>
             <w:r>
               <w:rPr>
                 <w:rFonts w:ascii="Calibri" w:eastAsia="Calibri" w:hAnsi="Calibri" w:cs="Tahoma"/>
@@ -1082,7 +1013,6 @@
               </w:rPr>
               <w:t>prix</w:t>
             </w:r>
-            <w:proofErr w:type="gramEnd"/>
             <w:r>
               <w:rPr>
                 <w:rFonts w:ascii="Calibri" w:eastAsia="Calibri" w:hAnsi="Calibri" w:cs="Tahoma"/>
@@ -1101,7 +1031,6 @@
               </w:rPr>
               <w:t>ttc</w:t>
             </w:r>
-            <w:proofErr w:type="spellEnd"/>
             <w:r>
               <w:rPr>
                 <w:rFonts w:ascii="Calibri" w:eastAsia="Calibri" w:hAnsi="Calibri" w:cs="Tahoma"/>
@@ -1186,8 +1115,6 @@
         </w:rPr>
         <w:t>{</w:t>
       </w:r>
-      <w:proofErr w:type="spellStart"/>
-      <w:proofErr w:type="gramStart"/>
       <w:r>
         <w:rPr>
           <w:rFonts w:ascii="Calibri" w:eastAsia="Calibri" w:hAnsi="Calibri" w:cs="Tahoma"/>
@@ -1197,7 +1124,6 @@
         </w:rPr>
         <w:t>prix</w:t>
       </w:r>
-      <w:proofErr w:type="gramEnd"/>
       <w:r>
         <w:rPr>
           <w:rFonts w:ascii="Calibri" w:eastAsia="Calibri" w:hAnsi="Calibri" w:cs="Tahoma"/>
@@ -1225,7 +1151,6 @@
         </w:rPr>
         <w:t>_lettres</w:t>
       </w:r>
-      <w:proofErr w:type="spellEnd"/>
       <w:r>
         <w:rPr>
           <w:rFonts w:ascii="Calibri" w:eastAsia="Calibri" w:hAnsi="Calibri" w:cs="Tahoma"/>
@@ -1489,7 +1414,6 @@
         </wp:anchor>
       </w:drawing>
     </w:r>
-    <w:proofErr w:type="spellStart"/>
     <w:r>
       <w:rPr>
         <w:rFonts w:ascii="Calibri" w:hAnsi="Calibri"/>
@@ -1498,18 +1422,7 @@
         <w:sz w:val="22"/>
         <w:szCs w:val="22"/>
       </w:rPr>
-      <w:t>Naltis</w:t>
-    </w:r>
-    <w:proofErr w:type="spellEnd"/>
-    <w:r>
-      <w:rPr>
-        <w:rFonts w:ascii="Calibri" w:hAnsi="Calibri"/>
-        <w:b/>
-        <w:bCs/>
-        <w:sz w:val="22"/>
-        <w:szCs w:val="22"/>
-      </w:rPr>
-      <w:t xml:space="preserve"> Communication - </w:t>
+      <w:t xml:space="preserve">Naltis Communication - </w:t>
     </w:r>
     <w:r>
       <w:rPr>
@@ -1779,7 +1692,6 @@
         <w:lang w:val="en-GB"/>
       </w:rPr>
     </w:pPr>
-    <w:proofErr w:type="gramStart"/>
     <w:r>
       <w:rPr>
         <w:rFonts w:ascii="Calibri" w:hAnsi="Calibri"/>
@@ -1798,9 +1710,8 @@
         <w:szCs w:val="20"/>
         <w:lang w:val="en-GB"/>
       </w:rPr>
-      <w:t xml:space="preserve"> :</w:t>
+      <w:t xml:space="preserve"> : contact@naltis.com</w:t>
     </w:r>
-    <w:proofErr w:type="gramEnd"/>
     <w:r>
       <w:rPr>
         <w:rFonts w:ascii="Calibri" w:hAnsi="Calibri"/>
@@ -1808,26 +1719,7 @@
         <w:szCs w:val="20"/>
         <w:lang w:val="en-GB"/>
       </w:rPr>
-      <w:t xml:space="preserve"> contact@naltis.com</w:t>
-    </w:r>
-    <w:r>
-      <w:rPr>
-        <w:rFonts w:ascii="Calibri" w:hAnsi="Calibri"/>
-        <w:sz w:val="20"/>
-        <w:szCs w:val="20"/>
-        <w:lang w:val="en-GB"/>
-      </w:rPr>
-      <w:t xml:space="preserve">   </w:t>
-    </w:r>
-    <w:proofErr w:type="gramStart"/>
-    <w:r>
-      <w:rPr>
-        <w:rFonts w:ascii="Calibri" w:hAnsi="Calibri"/>
-        <w:sz w:val="20"/>
-        <w:szCs w:val="20"/>
-        <w:lang w:val="en-GB"/>
-      </w:rPr>
-      <w:t xml:space="preserve">-  </w:t>
+      <w:t xml:space="preserve">   -  </w:t>
     </w:r>
     <w:r>
       <w:rPr>
@@ -1838,19 +1730,16 @@
         <w:szCs w:val="20"/>
         <w:lang w:val="en-GB"/>
       </w:rPr>
-      <w:t>RC</w:t>
+      <w:t>RC </w:t>
     </w:r>
-    <w:proofErr w:type="gramEnd"/>
     <w:r>
       <w:rPr>
         <w:rFonts w:ascii="Calibri" w:hAnsi="Calibri"/>
-        <w:b/>
-        <w:bCs/>
         <w:sz w:val="20"/>
         <w:szCs w:val="20"/>
         <w:lang w:val="en-GB"/>
       </w:rPr>
-      <w:t> </w:t>
+      <w:t>: 1340263A05</w:t>
     </w:r>
     <w:r>
       <w:rPr>
@@ -1859,38 +1748,8 @@
         <w:szCs w:val="20"/>
         <w:lang w:val="en-GB"/>
       </w:rPr>
-      <w:t>: 1340263A</w:t>
+      <w:t xml:space="preserve">  -  </w:t>
     </w:r>
-    <w:proofErr w:type="gramStart"/>
-    <w:r>
-      <w:rPr>
-        <w:rFonts w:ascii="Calibri" w:hAnsi="Calibri"/>
-        <w:sz w:val="20"/>
-        <w:szCs w:val="20"/>
-        <w:lang w:val="en-GB"/>
-      </w:rPr>
-      <w:t>05</w:t>
-    </w:r>
-    <w:r>
-      <w:rPr>
-        <w:rFonts w:ascii="Calibri" w:hAnsi="Calibri"/>
-        <w:sz w:val="20"/>
-        <w:szCs w:val="20"/>
-        <w:lang w:val="en-GB"/>
-      </w:rPr>
-      <w:t xml:space="preserve">  -</w:t>
-    </w:r>
-    <w:proofErr w:type="gramEnd"/>
-    <w:r>
-      <w:rPr>
-        <w:rFonts w:ascii="Calibri" w:hAnsi="Calibri"/>
-        <w:sz w:val="20"/>
-        <w:szCs w:val="20"/>
-        <w:lang w:val="en-GB"/>
-      </w:rPr>
-      <w:t xml:space="preserve">  </w:t>
-    </w:r>
-    <w:proofErr w:type="gramStart"/>
     <w:r>
       <w:rPr>
         <w:rFonts w:ascii="Calibri" w:hAnsi="Calibri"/>
@@ -1911,18 +1770,7 @@
         <w:szCs w:val="20"/>
         <w:lang w:val="en-GB"/>
       </w:rPr>
-      <w:t xml:space="preserve"> :</w:t>
-    </w:r>
-    <w:proofErr w:type="gramEnd"/>
-    <w:r>
-      <w:rPr>
-        <w:rFonts w:ascii="Calibri" w:hAnsi="Calibri"/>
-        <w:spacing w:val="20"/>
-        <w:sz w:val="20"/>
-        <w:szCs w:val="20"/>
-        <w:lang w:val="en-GB"/>
-      </w:rPr>
-      <w:t xml:space="preserve"> SGA 02100401113000016460</w:t>
+      <w:t xml:space="preserve"> : SGA 02100401113000016460</w:t>
     </w:r>
   </w:p>
   <w:p>

</xml_diff>